<commit_message>
Retirar CPF e ENDEREÇO do contrato
</commit_message>
<xml_diff>
--- a/Contrato_Studio_Life.docx
+++ b/Contrato_Studio_Life.docx
@@ -131,8 +131,13 @@
         </w:rPr>
         <w:t xml:space="preserve"> </w:t>
       </w:r>
-      <w:r>
-        <w:t xml:space="preserve">Diedrich </w:t>
+      <w:proofErr w:type="spellStart"/>
+      <w:r>
+        <w:t>Diedrich</w:t>
+      </w:r>
+      <w:proofErr w:type="spellEnd"/>
+      <w:r>
+        <w:t xml:space="preserve"> </w:t>
       </w:r>
     </w:p>
     <w:p>
@@ -142,10 +147,7 @@
         <w:ind w:left="68" w:right="7061"/>
       </w:pPr>
       <w:r>
-        <w:t>C</w:t>
-      </w:r>
-      <w:r>
-        <w:t>PF: 94178224034</w:t>
+        <w:t>CPF: 94178224034</w:t>
       </w:r>
     </w:p>
     <w:p>
@@ -191,7 +193,7 @@
           <w:tab w:val="left" w:pos="3770"/>
           <w:tab w:val="left" w:pos="6829"/>
         </w:tabs>
-        <w:spacing w:line="341" w:lineRule="auto"/>
+        <w:spacing w:line="480" w:lineRule="auto"/>
         <w:ind w:left="68" w:right="3374"/>
         <w:jc w:val="both"/>
       </w:pPr>
@@ -209,7 +211,7 @@
           <w:tab w:val="left" w:pos="3770"/>
           <w:tab w:val="left" w:pos="6829"/>
         </w:tabs>
-        <w:spacing w:line="340" w:lineRule="auto"/>
+        <w:spacing w:line="480" w:lineRule="auto"/>
         <w:ind w:left="70" w:right="3373"/>
         <w:jc w:val="both"/>
       </w:pPr>
@@ -217,7 +219,7 @@
         <w:t xml:space="preserve">CPF/CNPJ: </w:t>
       </w:r>
       <w:r>
-        <w:t>{{CPF}}</w:t>
+        <w:t>_________________________</w:t>
       </w:r>
     </w:p>
     <w:p>
@@ -226,6 +228,7 @@
         <w:tabs>
           <w:tab w:val="left" w:pos="7184"/>
         </w:tabs>
+        <w:spacing w:line="480" w:lineRule="auto"/>
         <w:ind w:left="70"/>
         <w:jc w:val="both"/>
       </w:pPr>
@@ -233,7 +236,7 @@
         <w:t xml:space="preserve">Endereço: </w:t>
       </w:r>
       <w:r>
-        <w:t>{{ENDERECO}}</w:t>
+        <w:t>_________________________________________________________________________</w:t>
       </w:r>
     </w:p>
     <w:p>
@@ -368,7 +371,15 @@
         <w:t xml:space="preserve"> </w:t>
       </w:r>
       <w:r>
-        <w:t>justo e contratado o presente Contrato de Prestação de Serviços de Aulas de Pilates, que se regerá pelas cláusulas e condições a seguir.</w:t>
+        <w:t xml:space="preserve">justo e contratado o presente Contrato de Prestação de Serviços de Aulas de </w:t>
+      </w:r>
+      <w:proofErr w:type="spellStart"/>
+      <w:r>
+        <w:t>Pilates</w:t>
+      </w:r>
+      <w:proofErr w:type="spellEnd"/>
+      <w:r>
+        <w:t>, que se regerá pelas cláusulas e condições a seguir.</w:t>
       </w:r>
     </w:p>
     <w:p>
@@ -528,9 +539,11 @@
         </w:rPr>
         <w:t xml:space="preserve"> </w:t>
       </w:r>
+      <w:proofErr w:type="spellStart"/>
       <w:r>
         <w:t>Pilates</w:t>
       </w:r>
+      <w:proofErr w:type="spellEnd"/>
       <w:r>
         <w:rPr>
           <w:spacing w:val="-5"/>
@@ -569,7 +582,7 @@
     <w:p>
       <w:pPr>
         <w:pStyle w:val="BodyText"/>
-        <w:spacing w:before="1"/>
+        <w:spacing w:before="1" w:line="360" w:lineRule="auto"/>
         <w:ind w:left="70"/>
         <w:jc w:val="both"/>
       </w:pPr>
@@ -607,7 +620,7 @@
           <w:tab w:val="left" w:pos="3464"/>
           <w:tab w:val="left" w:pos="6866"/>
         </w:tabs>
-        <w:spacing w:before="107" w:line="340" w:lineRule="auto"/>
+        <w:spacing w:before="107"/>
         <w:ind w:left="70" w:right="3337"/>
         <w:jc w:val="both"/>
       </w:pPr>
@@ -625,7 +638,7 @@
           <w:tab w:val="left" w:pos="3464"/>
           <w:tab w:val="left" w:pos="6866"/>
         </w:tabs>
-        <w:spacing w:before="107" w:line="340" w:lineRule="auto"/>
+        <w:spacing w:before="107"/>
         <w:ind w:left="70" w:right="3337"/>
         <w:jc w:val="both"/>
       </w:pPr>
@@ -1206,7 +1219,15 @@
         <w:t xml:space="preserve"> </w:t>
       </w:r>
       <w:r>
-        <w:t>equilíbrio econômico-financeiro do contrato.</w:t>
+        <w:t xml:space="preserve">equilíbrio </w:t>
+      </w:r>
+      <w:proofErr w:type="spellStart"/>
+      <w:r>
+        <w:t>econômico-financeiro</w:t>
+      </w:r>
+      <w:proofErr w:type="spellEnd"/>
+      <w:r>
+        <w:t xml:space="preserve"> do contrato.</w:t>
       </w:r>
     </w:p>
     <w:p>
@@ -1480,9 +1501,11 @@
         </w:rPr>
         <w:t xml:space="preserve"> </w:t>
       </w:r>
+      <w:proofErr w:type="spellStart"/>
       <w:r>
         <w:t>remanejamento</w:t>
       </w:r>
+      <w:proofErr w:type="spellEnd"/>
       <w:r>
         <w:rPr>
           <w:spacing w:val="-3"/>

</xml_diff>